<commit_message>
docs: actualizar README e informe con status, rmdir -r y GetClusterStatus
</commit_message>
<xml_diff>
--- a/Informe_Tecnico_Grupal_MiniDFS.docx
+++ b/Informe_Tecnico_Grupal_MiniDFS.docx
@@ -21907,6 +21907,1192 @@
         <w:t>Wikipedia – HDFS: https://es.wikipedia.org/wiki/Hadoop_Distributed_File_System</w:t>
       </w:r>
     </w:p>
+    <w:p>
+      <w:r>
+        <w:br w:type="page"/>
+      </w:r>
+    </w:p>
+    <w:p>
+      <w:pPr>
+        <w:pStyle w:val="Ttulo1"/>
+      </w:pPr>
+      <w:r>
+        <w:rPr>
+          <w:color w:val="1E3A8A"/>
+        </w:rPr>
+        <w:t>Actualización de Funcionalidades – Versión Final</w:t>
+      </w:r>
+    </w:p>
+    <w:p>
+      <w:pPr>
+        <w:spacing w:after="100"/>
+      </w:pPr>
+      <w:r>
+        <w:rPr>
+          <w:b w:val="0"/>
+          <w:i w:val="0"/>
+          <w:sz w:val="22"/>
+        </w:rPr>
+        <w:t>Durante la fase final del proyecto se implementaron dos mejoras sustanciales a la CLI y al protocolo gRPC que complementan la propuesta funcional original y fortalecen los criterios de evaluación relacionados con la observabilidad del clúster y la completitud de la interfaz de comandos.</w:t>
+      </w:r>
+    </w:p>
+    <w:p>
+      <w:pPr>
+        <w:pStyle w:val="Ttulo2"/>
+      </w:pPr>
+      <w:r>
+        <w:rPr>
+          <w:color w:val="0F766E"/>
+        </w:rPr>
+        <w:t>1. Comando status – Observabilidad del Clúster</w:t>
+      </w:r>
+    </w:p>
+    <w:p>
+      <w:pPr>
+        <w:spacing w:after="100"/>
+      </w:pPr>
+      <w:r>
+        <w:rPr>
+          <w:b w:val="0"/>
+          <w:i w:val="0"/>
+          <w:sz w:val="22"/>
+        </w:rPr>
+        <w:t>Se implementó el comando status en la CLI, respaldado por un nuevo RPC GetClusterStatus en el NameNode. Este comando permite visualizar en tiempo real el estado completo del sistema distribuido, incluyendo información de cada DataNode.</w:t>
+      </w:r>
+    </w:p>
+    <w:p>
+      <w:pPr>
+        <w:spacing w:after="100"/>
+      </w:pPr>
+      <w:r>
+        <w:rPr>
+          <w:b/>
+          <w:i w:val="0"/>
+          <w:sz w:val="22"/>
+        </w:rPr>
+        <w:t>Nuevos componentes implementados:</w:t>
+      </w:r>
+    </w:p>
+    <w:p>
+      <w:pPr>
+        <w:pStyle w:val="Listaconvietas"/>
+        <w:ind w:left="283"/>
+      </w:pPr>
+      <w:r>
+        <w:rPr>
+          <w:sz w:val="22"/>
+        </w:rPr>
+        <w:t>proto/dfs.proto: nuevo RPC GetClusterStatus, mensaje ClusterStatusRequest y mensajes DataNodeStatus y ClusterStatusResponse</w:t>
+      </w:r>
+    </w:p>
+    <w:p>
+      <w:pPr>
+        <w:pStyle w:val="Listaconvietas"/>
+        <w:ind w:left="283"/>
+      </w:pPr>
+      <w:r>
+        <w:rPr>
+          <w:sz w:val="22"/>
+        </w:rPr>
+        <w:t>namenode/server.py: handler GetClusterStatus que consulta el estado de todos los DataNodes en SQLite</w:t>
+      </w:r>
+    </w:p>
+    <w:p>
+      <w:pPr>
+        <w:pStyle w:val="Listaconvietas"/>
+        <w:ind w:left="283"/>
+      </w:pPr>
+      <w:r>
+        <w:rPr>
+          <w:sz w:val="22"/>
+        </w:rPr>
+        <w:t>namenode/metadata_store.py: métodos get_total_file_count() y get_total_block_count() para métricas globales</w:t>
+      </w:r>
+    </w:p>
+    <w:p>
+      <w:pPr>
+        <w:pStyle w:val="Listaconvietas"/>
+        <w:ind w:left="283"/>
+      </w:pPr>
+      <w:r>
+        <w:rPr>
+          <w:sz w:val="22"/>
+        </w:rPr>
+        <w:t>client/cli.py: comando status con salida formateada en tabla</w:t>
+      </w:r>
+    </w:p>
+    <w:p/>
+    <w:p>
+      <w:pPr>
+        <w:spacing w:after="100"/>
+      </w:pPr>
+      <w:r>
+        <w:rPr>
+          <w:b/>
+          <w:i w:val="0"/>
+          <w:sz w:val="22"/>
+        </w:rPr>
+        <w:t>Definición del nuevo RPC en el proto:</w:t>
+      </w:r>
+    </w:p>
+    <w:p>
+      <w:pPr>
+        <w:spacing w:before="40" w:after="40"/>
+        <w:ind w:left="567"/>
+        <w:shd w:val="clear" w:color="auto" w:fill="F1F5F9"/>
+      </w:pPr>
+      <w:r>
+        <w:rPr>
+          <w:rFonts w:ascii="Courier New" w:hAnsi="Courier New"/>
+          <w:color w:val="1E40AF"/>
+          <w:sz w:val="18"/>
+        </w:rPr>
+        <w:t>rpc GetClusterStatus(ClusterStatusRequest) returns (ClusterStatusResponse);</w:t>
+      </w:r>
+    </w:p>
+    <w:p>
+      <w:pPr>
+        <w:spacing w:before="40" w:after="40"/>
+        <w:ind w:left="567"/>
+        <w:shd w:val="clear" w:color="auto" w:fill="F1F5F9"/>
+      </w:pPr>
+      <w:r>
+        <w:rPr>
+          <w:rFonts w:ascii="Courier New" w:hAnsi="Courier New"/>
+          <w:color w:val="1E40AF"/>
+          <w:sz w:val="18"/>
+        </w:rPr>
+      </w:r>
+    </w:p>
+    <w:p>
+      <w:pPr>
+        <w:spacing w:before="40" w:after="40"/>
+        <w:ind w:left="567"/>
+        <w:shd w:val="clear" w:color="auto" w:fill="F1F5F9"/>
+      </w:pPr>
+      <w:r>
+        <w:rPr>
+          <w:rFonts w:ascii="Courier New" w:hAnsi="Courier New"/>
+          <w:color w:val="1E40AF"/>
+          <w:sz w:val="18"/>
+        </w:rPr>
+        <w:t>message DataNodeStatus {</w:t>
+      </w:r>
+    </w:p>
+    <w:p>
+      <w:pPr>
+        <w:spacing w:before="40" w:after="40"/>
+        <w:ind w:left="567"/>
+        <w:shd w:val="clear" w:color="auto" w:fill="F1F5F9"/>
+      </w:pPr>
+      <w:r>
+        <w:rPr>
+          <w:rFonts w:ascii="Courier New" w:hAnsi="Courier New"/>
+          <w:color w:val="1E40AF"/>
+          <w:sz w:val="18"/>
+        </w:rPr>
+        <w:t xml:space="preserve">  string node_id         = 1;  // Identificador del nodo</w:t>
+      </w:r>
+    </w:p>
+    <w:p>
+      <w:pPr>
+        <w:spacing w:before="40" w:after="40"/>
+        <w:ind w:left="567"/>
+        <w:shd w:val="clear" w:color="auto" w:fill="F1F5F9"/>
+      </w:pPr>
+      <w:r>
+        <w:rPr>
+          <w:rFonts w:ascii="Courier New" w:hAnsi="Courier New"/>
+          <w:color w:val="1E40AF"/>
+          <w:sz w:val="18"/>
+        </w:rPr>
+        <w:t xml:space="preserve">  string host            = 2;  // Dirección IP</w:t>
+      </w:r>
+    </w:p>
+    <w:p>
+      <w:pPr>
+        <w:spacing w:before="40" w:after="40"/>
+        <w:ind w:left="567"/>
+        <w:shd w:val="clear" w:color="auto" w:fill="F1F5F9"/>
+      </w:pPr>
+      <w:r>
+        <w:rPr>
+          <w:rFonts w:ascii="Courier New" w:hAnsi="Courier New"/>
+          <w:color w:val="1E40AF"/>
+          <w:sz w:val="18"/>
+        </w:rPr>
+        <w:t xml:space="preserve">  int32  port            = 3;  // Puerto gRPC</w:t>
+      </w:r>
+    </w:p>
+    <w:p>
+      <w:pPr>
+        <w:spacing w:before="40" w:after="40"/>
+        <w:ind w:left="567"/>
+        <w:shd w:val="clear" w:color="auto" w:fill="F1F5F9"/>
+      </w:pPr>
+      <w:r>
+        <w:rPr>
+          <w:rFonts w:ascii="Courier New" w:hAnsi="Courier New"/>
+          <w:color w:val="1E40AF"/>
+          <w:sz w:val="18"/>
+        </w:rPr>
+        <w:t xml:space="preserve">  string status          = 4;  // 'active' | 'inactive'</w:t>
+      </w:r>
+    </w:p>
+    <w:p>
+      <w:pPr>
+        <w:spacing w:before="40" w:after="40"/>
+        <w:ind w:left="567"/>
+        <w:shd w:val="clear" w:color="auto" w:fill="F1F5F9"/>
+      </w:pPr>
+      <w:r>
+        <w:rPr>
+          <w:rFonts w:ascii="Courier New" w:hAnsi="Courier New"/>
+          <w:color w:val="1E40AF"/>
+          <w:sz w:val="18"/>
+        </w:rPr>
+        <w:t xml:space="preserve">  int32  block_count     = 5;  // Bloques almacenados en este nodo</w:t>
+      </w:r>
+    </w:p>
+    <w:p>
+      <w:pPr>
+        <w:spacing w:before="40" w:after="40"/>
+        <w:ind w:left="567"/>
+        <w:shd w:val="clear" w:color="auto" w:fill="F1F5F9"/>
+      </w:pPr>
+      <w:r>
+        <w:rPr>
+          <w:rFonts w:ascii="Courier New" w:hAnsi="Courier New"/>
+          <w:color w:val="1E40AF"/>
+          <w:sz w:val="18"/>
+        </w:rPr>
+        <w:t xml:space="preserve">  int64  available_space = 6;  // Espacio libre en bytes</w:t>
+      </w:r>
+    </w:p>
+    <w:p>
+      <w:pPr>
+        <w:spacing w:before="40" w:after="40"/>
+        <w:ind w:left="567"/>
+        <w:shd w:val="clear" w:color="auto" w:fill="F1F5F9"/>
+      </w:pPr>
+      <w:r>
+        <w:rPr>
+          <w:rFonts w:ascii="Courier New" w:hAnsi="Courier New"/>
+          <w:color w:val="1E40AF"/>
+          <w:sz w:val="18"/>
+        </w:rPr>
+        <w:t xml:space="preserve">  string last_heartbeat  = 7;  // Timestamp del último HB recibido</w:t>
+      </w:r>
+    </w:p>
+    <w:p>
+      <w:pPr>
+        <w:spacing w:before="40" w:after="40"/>
+        <w:ind w:left="567"/>
+        <w:shd w:val="clear" w:color="auto" w:fill="F1F5F9"/>
+      </w:pPr>
+      <w:r>
+        <w:rPr>
+          <w:rFonts w:ascii="Courier New" w:hAnsi="Courier New"/>
+          <w:color w:val="1E40AF"/>
+          <w:sz w:val="18"/>
+        </w:rPr>
+        <w:t>}</w:t>
+      </w:r>
+    </w:p>
+    <w:p>
+      <w:pPr>
+        <w:spacing w:before="40" w:after="40"/>
+        <w:ind w:left="567"/>
+        <w:shd w:val="clear" w:color="auto" w:fill="F1F5F9"/>
+      </w:pPr>
+      <w:r>
+        <w:rPr>
+          <w:rFonts w:ascii="Courier New" w:hAnsi="Courier New"/>
+          <w:color w:val="1E40AF"/>
+          <w:sz w:val="18"/>
+        </w:rPr>
+      </w:r>
+    </w:p>
+    <w:p>
+      <w:pPr>
+        <w:spacing w:before="40" w:after="40"/>
+        <w:ind w:left="567"/>
+        <w:shd w:val="clear" w:color="auto" w:fill="F1F5F9"/>
+      </w:pPr>
+      <w:r>
+        <w:rPr>
+          <w:rFonts w:ascii="Courier New" w:hAnsi="Courier New"/>
+          <w:color w:val="1E40AF"/>
+          <w:sz w:val="18"/>
+        </w:rPr>
+        <w:t>message ClusterStatusResponse {</w:t>
+      </w:r>
+    </w:p>
+    <w:p>
+      <w:pPr>
+        <w:spacing w:before="40" w:after="40"/>
+        <w:ind w:left="567"/>
+        <w:shd w:val="clear" w:color="auto" w:fill="F1F5F9"/>
+      </w:pPr>
+      <w:r>
+        <w:rPr>
+          <w:rFonts w:ascii="Courier New" w:hAnsi="Courier New"/>
+          <w:color w:val="1E40AF"/>
+          <w:sz w:val="18"/>
+        </w:rPr>
+        <w:t xml:space="preserve">  bool                    success      = 1;</w:t>
+      </w:r>
+    </w:p>
+    <w:p>
+      <w:pPr>
+        <w:spacing w:before="40" w:after="40"/>
+        <w:ind w:left="567"/>
+        <w:shd w:val="clear" w:color="auto" w:fill="F1F5F9"/>
+      </w:pPr>
+      <w:r>
+        <w:rPr>
+          <w:rFonts w:ascii="Courier New" w:hAnsi="Courier New"/>
+          <w:color w:val="1E40AF"/>
+          <w:sz w:val="18"/>
+        </w:rPr>
+        <w:t xml:space="preserve">  repeated DataNodeStatus datanodes    = 2;</w:t>
+      </w:r>
+    </w:p>
+    <w:p>
+      <w:pPr>
+        <w:spacing w:before="40" w:after="40"/>
+        <w:ind w:left="567"/>
+        <w:shd w:val="clear" w:color="auto" w:fill="F1F5F9"/>
+      </w:pPr>
+      <w:r>
+        <w:rPr>
+          <w:rFonts w:ascii="Courier New" w:hAnsi="Courier New"/>
+          <w:color w:val="1E40AF"/>
+          <w:sz w:val="18"/>
+        </w:rPr>
+        <w:t xml:space="preserve">  int32                   total_blocks = 3;</w:t>
+      </w:r>
+    </w:p>
+    <w:p>
+      <w:pPr>
+        <w:spacing w:before="40" w:after="40"/>
+        <w:ind w:left="567"/>
+        <w:shd w:val="clear" w:color="auto" w:fill="F1F5F9"/>
+      </w:pPr>
+      <w:r>
+        <w:rPr>
+          <w:rFonts w:ascii="Courier New" w:hAnsi="Courier New"/>
+          <w:color w:val="1E40AF"/>
+          <w:sz w:val="18"/>
+        </w:rPr>
+        <w:t xml:space="preserve">  int32                   total_files  = 4;</w:t>
+      </w:r>
+    </w:p>
+    <w:p>
+      <w:pPr>
+        <w:spacing w:before="40" w:after="40"/>
+        <w:ind w:left="567"/>
+        <w:shd w:val="clear" w:color="auto" w:fill="F1F5F9"/>
+      </w:pPr>
+      <w:r>
+        <w:rPr>
+          <w:rFonts w:ascii="Courier New" w:hAnsi="Courier New"/>
+          <w:color w:val="1E40AF"/>
+          <w:sz w:val="18"/>
+        </w:rPr>
+        <w:t xml:space="preserve">  string                  message      = 5;</w:t>
+      </w:r>
+    </w:p>
+    <w:p>
+      <w:pPr>
+        <w:spacing w:before="40" w:after="40"/>
+        <w:ind w:left="567"/>
+        <w:shd w:val="clear" w:color="auto" w:fill="F1F5F9"/>
+      </w:pPr>
+      <w:r>
+        <w:rPr>
+          <w:rFonts w:ascii="Courier New" w:hAnsi="Courier New"/>
+          <w:color w:val="1E40AF"/>
+          <w:sz w:val="18"/>
+        </w:rPr>
+        <w:t>}</w:t>
+      </w:r>
+    </w:p>
+    <w:p/>
+    <w:p>
+      <w:pPr>
+        <w:spacing w:after="100"/>
+      </w:pPr>
+      <w:r>
+        <w:rPr>
+          <w:b/>
+          <w:i w:val="0"/>
+          <w:sz w:val="22"/>
+        </w:rPr>
+        <w:t>Ejemplo de salida del comando:</w:t>
+      </w:r>
+    </w:p>
+    <w:p>
+      <w:pPr>
+        <w:spacing w:before="40" w:after="40"/>
+        <w:ind w:left="567"/>
+        <w:shd w:val="clear" w:color="auto" w:fill="F1F5F9"/>
+      </w:pPr>
+      <w:r>
+        <w:rPr>
+          <w:rFonts w:ascii="Courier New" w:hAnsi="Courier New"/>
+          <w:color w:val="1E40AF"/>
+          <w:sz w:val="18"/>
+        </w:rPr>
+        <w:t>$ python cli.py status</w:t>
+      </w:r>
+    </w:p>
+    <w:p>
+      <w:pPr>
+        <w:spacing w:before="40" w:after="40"/>
+        <w:ind w:left="567"/>
+        <w:shd w:val="clear" w:color="auto" w:fill="F1F5F9"/>
+      </w:pPr>
+      <w:r>
+        <w:rPr>
+          <w:rFonts w:ascii="Courier New" w:hAnsi="Courier New"/>
+          <w:color w:val="1E40AF"/>
+          <w:sz w:val="18"/>
+        </w:rPr>
+      </w:r>
+    </w:p>
+    <w:p>
+      <w:pPr>
+        <w:spacing w:before="40" w:after="40"/>
+        <w:ind w:left="567"/>
+        <w:shd w:val="clear" w:color="auto" w:fill="F1F5F9"/>
+      </w:pPr>
+      <w:r>
+        <w:rPr>
+          <w:rFonts w:ascii="Courier New" w:hAnsi="Courier New"/>
+          <w:color w:val="1E40AF"/>
+          <w:sz w:val="18"/>
+        </w:rPr>
+        <w:t>╔══════════════════════════════════════════════════════════════╗</w:t>
+      </w:r>
+    </w:p>
+    <w:p>
+      <w:pPr>
+        <w:spacing w:before="40" w:after="40"/>
+        <w:ind w:left="567"/>
+        <w:shd w:val="clear" w:color="auto" w:fill="F1F5F9"/>
+      </w:pPr>
+      <w:r>
+        <w:rPr>
+          <w:rFonts w:ascii="Courier New" w:hAnsi="Courier New"/>
+          <w:color w:val="1E40AF"/>
+          <w:sz w:val="18"/>
+        </w:rPr>
+        <w:t>║            MiniDFS – Estado del Clúster                     ║</w:t>
+      </w:r>
+    </w:p>
+    <w:p>
+      <w:pPr>
+        <w:spacing w:before="40" w:after="40"/>
+        <w:ind w:left="567"/>
+        <w:shd w:val="clear" w:color="auto" w:fill="F1F5F9"/>
+      </w:pPr>
+      <w:r>
+        <w:rPr>
+          <w:rFonts w:ascii="Courier New" w:hAnsi="Courier New"/>
+          <w:color w:val="1E40AF"/>
+          <w:sz w:val="18"/>
+        </w:rPr>
+        <w:t>╚══════════════════════════════════════════════════════════════╝</w:t>
+      </w:r>
+    </w:p>
+    <w:p>
+      <w:pPr>
+        <w:spacing w:before="40" w:after="40"/>
+        <w:ind w:left="567"/>
+        <w:shd w:val="clear" w:color="auto" w:fill="F1F5F9"/>
+      </w:pPr>
+      <w:r>
+        <w:rPr>
+          <w:rFonts w:ascii="Courier New" w:hAnsi="Courier New"/>
+          <w:color w:val="1E40AF"/>
+          <w:sz w:val="18"/>
+        </w:rPr>
+      </w:r>
+    </w:p>
+    <w:p>
+      <w:pPr>
+        <w:spacing w:before="40" w:after="40"/>
+        <w:ind w:left="567"/>
+        <w:shd w:val="clear" w:color="auto" w:fill="F1F5F9"/>
+      </w:pPr>
+      <w:r>
+        <w:rPr>
+          <w:rFonts w:ascii="Courier New" w:hAnsi="Courier New"/>
+          <w:color w:val="1E40AF"/>
+          <w:sz w:val="18"/>
+        </w:rPr>
+        <w:t xml:space="preserve">  Archivos activos : 1</w:t>
+      </w:r>
+    </w:p>
+    <w:p>
+      <w:pPr>
+        <w:spacing w:before="40" w:after="40"/>
+        <w:ind w:left="567"/>
+        <w:shd w:val="clear" w:color="auto" w:fill="F1F5F9"/>
+      </w:pPr>
+      <w:r>
+        <w:rPr>
+          <w:rFonts w:ascii="Courier New" w:hAnsi="Courier New"/>
+          <w:color w:val="1E40AF"/>
+          <w:sz w:val="18"/>
+        </w:rPr>
+        <w:t xml:space="preserve">  Bloques únicos   : 3</w:t>
+      </w:r>
+    </w:p>
+    <w:p>
+      <w:pPr>
+        <w:spacing w:before="40" w:after="40"/>
+        <w:ind w:left="567"/>
+        <w:shd w:val="clear" w:color="auto" w:fill="F1F5F9"/>
+      </w:pPr>
+      <w:r>
+        <w:rPr>
+          <w:rFonts w:ascii="Courier New" w:hAnsi="Courier New"/>
+          <w:color w:val="1E40AF"/>
+          <w:sz w:val="18"/>
+        </w:rPr>
+        <w:t xml:space="preserve">  DataNodes        : 3</w:t>
+      </w:r>
+    </w:p>
+    <w:p>
+      <w:pPr>
+        <w:spacing w:before="40" w:after="40"/>
+        <w:ind w:left="567"/>
+        <w:shd w:val="clear" w:color="auto" w:fill="F1F5F9"/>
+      </w:pPr>
+      <w:r>
+        <w:rPr>
+          <w:rFonts w:ascii="Courier New" w:hAnsi="Courier New"/>
+          <w:color w:val="1E40AF"/>
+          <w:sz w:val="18"/>
+        </w:rPr>
+      </w:r>
+    </w:p>
+    <w:p>
+      <w:pPr>
+        <w:spacing w:before="40" w:after="40"/>
+        <w:ind w:left="567"/>
+        <w:shd w:val="clear" w:color="auto" w:fill="F1F5F9"/>
+      </w:pPr>
+      <w:r>
+        <w:rPr>
+          <w:rFonts w:ascii="Courier New" w:hAnsi="Courier New"/>
+          <w:color w:val="1E40AF"/>
+          <w:sz w:val="18"/>
+        </w:rPr>
+        <w:t xml:space="preserve">  ID     Host             Puerto  Estado       Bloques  Espacio libre  Último HB</w:t>
+      </w:r>
+    </w:p>
+    <w:p>
+      <w:pPr>
+        <w:spacing w:before="40" w:after="40"/>
+        <w:ind w:left="567"/>
+        <w:shd w:val="clear" w:color="auto" w:fill="F1F5F9"/>
+      </w:pPr>
+      <w:r>
+        <w:rPr>
+          <w:rFonts w:ascii="Courier New" w:hAnsi="Courier New"/>
+          <w:color w:val="1E40AF"/>
+          <w:sz w:val="18"/>
+        </w:rPr>
+        <w:t xml:space="preserve">  ─────────────────────────────────────────────────────────────────────────────</w:t>
+      </w:r>
+    </w:p>
+    <w:p>
+      <w:pPr>
+        <w:spacing w:before="40" w:after="40"/>
+        <w:ind w:left="567"/>
+        <w:shd w:val="clear" w:color="auto" w:fill="F1F5F9"/>
+      </w:pPr>
+      <w:r>
+        <w:rPr>
+          <w:rFonts w:ascii="Courier New" w:hAnsi="Courier New"/>
+          <w:color w:val="1E40AF"/>
+          <w:sz w:val="18"/>
+        </w:rPr>
+        <w:t xml:space="preserve">  dn1    172.31.5.1        50061  ✅ activo          1      37.3 GB  2026-05-24</w:t>
+      </w:r>
+    </w:p>
+    <w:p>
+      <w:pPr>
+        <w:spacing w:before="40" w:after="40"/>
+        <w:ind w:left="567"/>
+        <w:shd w:val="clear" w:color="auto" w:fill="F1F5F9"/>
+      </w:pPr>
+      <w:r>
+        <w:rPr>
+          <w:rFonts w:ascii="Courier New" w:hAnsi="Courier New"/>
+          <w:color w:val="1E40AF"/>
+          <w:sz w:val="18"/>
+        </w:rPr>
+        <w:t xml:space="preserve">  dn2    172.31.9.175      50062  ✅ activo          1      37.3 GB  2026-05-24</w:t>
+      </w:r>
+    </w:p>
+    <w:p>
+      <w:pPr>
+        <w:spacing w:before="40" w:after="40"/>
+        <w:ind w:left="567"/>
+        <w:shd w:val="clear" w:color="auto" w:fill="F1F5F9"/>
+      </w:pPr>
+      <w:r>
+        <w:rPr>
+          <w:rFonts w:ascii="Courier New" w:hAnsi="Courier New"/>
+          <w:color w:val="1E40AF"/>
+          <w:sz w:val="18"/>
+        </w:rPr>
+        <w:t xml:space="preserve">  dn3    172.31.9.76       50063  ✅ activo          1      37.3 GB  2026-05-24</w:t>
+      </w:r>
+    </w:p>
+    <w:p/>
+    <w:p>
+      <w:pPr>
+        <w:spacing w:after="100"/>
+      </w:pPr>
+      <w:r>
+        <w:rPr>
+          <w:b w:val="0"/>
+          <w:i/>
+          <w:sz w:val="22"/>
+        </w:rPr>
+        <w:t>Este comando es particularmente útil para evidenciar que los bloques están efectivamente distribuidos entre múltiples DataNodes, demostrando visualmente el criterio de distribución de datos del sistema.</w:t>
+      </w:r>
+    </w:p>
+    <w:p>
+      <w:pPr>
+        <w:pStyle w:val="Ttulo2"/>
+      </w:pPr>
+      <w:r>
+        <w:rPr>
+          <w:color w:val="0F766E"/>
+        </w:rPr>
+        <w:t>2. Comando rmdir -r – Eliminación Recursiva de Directorios</w:t>
+      </w:r>
+    </w:p>
+    <w:p>
+      <w:pPr>
+        <w:spacing w:after="100"/>
+      </w:pPr>
+      <w:r>
+        <w:rPr>
+          <w:b w:val="0"/>
+          <w:i w:val="0"/>
+          <w:sz w:val="22"/>
+        </w:rPr>
+        <w:t>El comando rmdir fue extendido para soportar eliminación recursiva mediante la flag -r. Anteriormente solo permitía eliminar directorios vacíos; ahora puede eliminar un árbol completo de directorios y archivos en una sola operación.</w:t>
+      </w:r>
+    </w:p>
+    <w:p>
+      <w:pPr>
+        <w:spacing w:after="100"/>
+      </w:pPr>
+      <w:r>
+        <w:rPr>
+          <w:b/>
+          <w:i w:val="0"/>
+          <w:sz w:val="22"/>
+        </w:rPr>
+        <w:t>Archivos modificados:</w:t>
+      </w:r>
+    </w:p>
+    <w:p>
+      <w:pPr>
+        <w:pStyle w:val="Listaconvietas"/>
+        <w:ind w:left="283"/>
+      </w:pPr>
+      <w:r>
+        <w:rPr>
+          <w:sz w:val="22"/>
+        </w:rPr>
+        <w:t>proto/dfs.proto: campo recursive: bool = 3 añadido a RemoveDirRequest</w:t>
+      </w:r>
+    </w:p>
+    <w:p>
+      <w:pPr>
+        <w:pStyle w:val="Listaconvietas"/>
+        <w:ind w:left="283"/>
+      </w:pPr>
+      <w:r>
+        <w:rPr>
+          <w:sz w:val="22"/>
+        </w:rPr>
+        <w:t>namenode/namespace_manager.py: nuevo método _remove_dir_recursive() que elimina archivos y subdirectorios en orden de profundidad</w:t>
+      </w:r>
+    </w:p>
+    <w:p>
+      <w:pPr>
+        <w:pStyle w:val="Listaconvietas"/>
+        <w:ind w:left="283"/>
+      </w:pPr>
+      <w:r>
+        <w:rPr>
+          <w:sz w:val="22"/>
+        </w:rPr>
+        <w:t>namenode/metadata_store.py: nuevos métodos list_all_files_under() y list_all_dirs_under() para consultas recursivas</w:t>
+      </w:r>
+    </w:p>
+    <w:p>
+      <w:pPr>
+        <w:pStyle w:val="Listaconvietas"/>
+        <w:ind w:left="283"/>
+      </w:pPr>
+      <w:r>
+        <w:rPr>
+          <w:sz w:val="22"/>
+        </w:rPr>
+        <w:t>client/cli.py: flag -r / --recursive añadida al subcomando rmdir</w:t>
+      </w:r>
+    </w:p>
+    <w:p/>
+    <w:p>
+      <w:pPr>
+        <w:spacing w:after="100"/>
+      </w:pPr>
+      <w:r>
+        <w:rPr>
+          <w:b/>
+          <w:i w:val="0"/>
+          <w:sz w:val="22"/>
+        </w:rPr>
+        <w:t>Uso desde la CLI:</w:t>
+      </w:r>
+    </w:p>
+    <w:p>
+      <w:pPr>
+        <w:spacing w:before="40" w:after="40"/>
+        <w:ind w:left="567"/>
+        <w:shd w:val="clear" w:color="auto" w:fill="F1F5F9"/>
+      </w:pPr>
+      <w:r>
+        <w:rPr>
+          <w:rFonts w:ascii="Courier New" w:hAnsi="Courier New"/>
+          <w:color w:val="1E40AF"/>
+          <w:sz w:val="18"/>
+        </w:rPr>
+        <w:t># Eliminar directorio vacío (comportamiento original)</w:t>
+      </w:r>
+    </w:p>
+    <w:p>
+      <w:pPr>
+        <w:spacing w:before="40" w:after="40"/>
+        <w:ind w:left="567"/>
+        <w:shd w:val="clear" w:color="auto" w:fill="F1F5F9"/>
+      </w:pPr>
+      <w:r>
+        <w:rPr>
+          <w:rFonts w:ascii="Courier New" w:hAnsi="Courier New"/>
+          <w:color w:val="1E40AF"/>
+          <w:sz w:val="18"/>
+        </w:rPr>
+        <w:t>python cli.py rmdir /datos</w:t>
+      </w:r>
+    </w:p>
+    <w:p>
+      <w:pPr>
+        <w:spacing w:before="40" w:after="40"/>
+        <w:ind w:left="567"/>
+        <w:shd w:val="clear" w:color="auto" w:fill="F1F5F9"/>
+      </w:pPr>
+      <w:r>
+        <w:rPr>
+          <w:rFonts w:ascii="Courier New" w:hAnsi="Courier New"/>
+          <w:color w:val="1E40AF"/>
+          <w:sz w:val="18"/>
+        </w:rPr>
+      </w:r>
+    </w:p>
+    <w:p>
+      <w:pPr>
+        <w:spacing w:before="40" w:after="40"/>
+        <w:ind w:left="567"/>
+        <w:shd w:val="clear" w:color="auto" w:fill="F1F5F9"/>
+      </w:pPr>
+      <w:r>
+        <w:rPr>
+          <w:rFonts w:ascii="Courier New" w:hAnsi="Courier New"/>
+          <w:color w:val="1E40AF"/>
+          <w:sz w:val="18"/>
+        </w:rPr>
+        <w:t># Eliminar directorio con todo su contenido (nuevo)</w:t>
+      </w:r>
+    </w:p>
+    <w:p>
+      <w:pPr>
+        <w:spacing w:before="40" w:after="40"/>
+        <w:ind w:left="567"/>
+        <w:shd w:val="clear" w:color="auto" w:fill="F1F5F9"/>
+      </w:pPr>
+      <w:r>
+        <w:rPr>
+          <w:rFonts w:ascii="Courier New" w:hAnsi="Courier New"/>
+          <w:color w:val="1E40AF"/>
+          <w:sz w:val="18"/>
+        </w:rPr>
+        <w:t>python cli.py rmdir -r /datos</w:t>
+      </w:r>
+    </w:p>
+    <w:p>
+      <w:pPr>
+        <w:spacing w:before="40" w:after="40"/>
+        <w:ind w:left="567"/>
+        <w:shd w:val="clear" w:color="auto" w:fill="F1F5F9"/>
+      </w:pPr>
+      <w:r>
+        <w:rPr>
+          <w:rFonts w:ascii="Courier New" w:hAnsi="Courier New"/>
+          <w:color w:val="1E40AF"/>
+          <w:sz w:val="18"/>
+        </w:rPr>
+        <w:t># Salida: Directorio eliminado recursivamente: /datos (3 archivos eliminados)</w:t>
+      </w:r>
+    </w:p>
+    <w:p/>
+    <w:p>
+      <w:pPr>
+        <w:spacing w:after="100"/>
+      </w:pPr>
+      <w:r>
+        <w:rPr>
+          <w:b/>
+          <w:i w:val="0"/>
+          <w:sz w:val="22"/>
+        </w:rPr>
+        <w:t>Algoritmo de eliminación recursiva:</w:t>
+      </w:r>
+    </w:p>
+    <w:p>
+      <w:pPr>
+        <w:spacing w:after="100"/>
+        <w:ind w:left="283"/>
+      </w:pPr>
+      <w:r>
+        <w:rPr>
+          <w:b w:val="0"/>
+          <w:i w:val="0"/>
+          <w:sz w:val="22"/>
+        </w:rPr>
+        <w:t>La implementación sigue un orden seguro: primero elimina todos los archivos activos bajo el directorio (marcándolos como deleted y borrando sus block_locations de SQLite), luego elimina los subdirectorios ordenados de mayor a menor profundidad para evitar violar restricciones de integridad, y finalmente elimina el directorio raíz de la operación.</w:t>
+      </w:r>
+    </w:p>
+    <w:p>
+      <w:pPr>
+        <w:pStyle w:val="Ttulo2"/>
+      </w:pPr>
+      <w:r>
+        <w:rPr>
+          <w:color w:val="0F766E"/>
+        </w:rPr>
+        <w:t>3. Resumen de Archivos Modificados</w:t>
+      </w:r>
+    </w:p>
+    <w:tbl>
+      <w:tblPr>
+        <w:tblStyle w:val="Sombreadoclaro-nfasis1"/>
+        <w:tblW w:type="auto" w:w="0"/>
+        <w:tblLook w:firstColumn="1" w:firstRow="1" w:lastColumn="0" w:lastRow="0" w:noHBand="0" w:noVBand="1" w:val="04A0"/>
+      </w:tblPr>
+      <w:tblGrid>
+        <w:gridCol w:w="3041"/>
+        <w:gridCol w:w="3041"/>
+        <w:gridCol w:w="3041"/>
+      </w:tblGrid>
+      <w:tr>
+        <w:tc>
+          <w:tcPr>
+            <w:tcW w:type="dxa" w:w="3041"/>
+            <w:shd w:val="clear" w:color="auto" w:fill="0F766E"/>
+          </w:tcPr>
+          <w:p>
+            <w:r>
+              <w:rPr>
+                <w:b/>
+                <w:color w:val="FFFFFF"/>
+              </w:rPr>
+              <w:t>Archivo</w:t>
+            </w:r>
+          </w:p>
+        </w:tc>
+        <w:tc>
+          <w:tcPr>
+            <w:tcW w:type="dxa" w:w="3041"/>
+            <w:shd w:val="clear" w:color="auto" w:fill="0F766E"/>
+          </w:tcPr>
+          <w:p>
+            <w:r>
+              <w:rPr>
+                <w:b/>
+                <w:color w:val="FFFFFF"/>
+              </w:rPr>
+              <w:t>Tipo de cambio</w:t>
+            </w:r>
+          </w:p>
+        </w:tc>
+        <w:tc>
+          <w:tcPr>
+            <w:tcW w:type="dxa" w:w="3041"/>
+            <w:shd w:val="clear" w:color="auto" w:fill="0F766E"/>
+          </w:tcPr>
+          <w:p>
+            <w:r>
+              <w:rPr>
+                <w:b/>
+                <w:color w:val="FFFFFF"/>
+              </w:rPr>
+              <w:t>Descripción</w:t>
+            </w:r>
+          </w:p>
+        </w:tc>
+      </w:tr>
+      <w:tr>
+        <w:tc>
+          <w:tcPr>
+            <w:tcW w:type="dxa" w:w="3041"/>
+          </w:tcPr>
+          <w:p>
+            <w:r>
+              <w:t>proto/dfs.proto</w:t>
+            </w:r>
+          </w:p>
+        </w:tc>
+        <w:tc>
+          <w:tcPr>
+            <w:tcW w:type="dxa" w:w="3041"/>
+          </w:tcPr>
+          <w:p>
+            <w:r>
+              <w:t>MODIFICADO</w:t>
+            </w:r>
+          </w:p>
+        </w:tc>
+        <w:tc>
+          <w:tcPr>
+            <w:tcW w:type="dxa" w:w="3041"/>
+          </w:tcPr>
+          <w:p>
+            <w:r>
+              <w:t>Nuevo RPC GetClusterStatus + campo recursive en RemoveDirRequest</w:t>
+            </w:r>
+          </w:p>
+        </w:tc>
+      </w:tr>
+      <w:tr>
+        <w:tc>
+          <w:tcPr>
+            <w:tcW w:type="dxa" w:w="3041"/>
+          </w:tcPr>
+          <w:p>
+            <w:r>
+              <w:t>proto/dfs_pb2.py</w:t>
+            </w:r>
+          </w:p>
+        </w:tc>
+        <w:tc>
+          <w:tcPr>
+            <w:tcW w:type="dxa" w:w="3041"/>
+          </w:tcPr>
+          <w:p>
+            <w:r>
+              <w:t>REGENERADO</w:t>
+            </w:r>
+          </w:p>
+        </w:tc>
+        <w:tc>
+          <w:tcPr>
+            <w:tcW w:type="dxa" w:w="3041"/>
+          </w:tcPr>
+          <w:p>
+            <w:r>
+              <w:t>Stubs de mensajes actualizados automáticamente</w:t>
+            </w:r>
+          </w:p>
+        </w:tc>
+      </w:tr>
+      <w:tr>
+        <w:tc>
+          <w:tcPr>
+            <w:tcW w:type="dxa" w:w="3041"/>
+          </w:tcPr>
+          <w:p>
+            <w:r>
+              <w:t>proto/dfs_pb2_grpc.py</w:t>
+            </w:r>
+          </w:p>
+        </w:tc>
+        <w:tc>
+          <w:tcPr>
+            <w:tcW w:type="dxa" w:w="3041"/>
+          </w:tcPr>
+          <w:p>
+            <w:r>
+              <w:t>REGENERADO</w:t>
+            </w:r>
+          </w:p>
+        </w:tc>
+        <w:tc>
+          <w:tcPr>
+            <w:tcW w:type="dxa" w:w="3041"/>
+          </w:tcPr>
+          <w:p>
+            <w:r>
+              <w:t>Stubs de servicios actualizados automáticamente</w:t>
+            </w:r>
+          </w:p>
+        </w:tc>
+      </w:tr>
+      <w:tr>
+        <w:tc>
+          <w:tcPr>
+            <w:tcW w:type="dxa" w:w="3041"/>
+          </w:tcPr>
+          <w:p>
+            <w:r>
+              <w:t>namenode/server.py</w:t>
+            </w:r>
+          </w:p>
+        </w:tc>
+        <w:tc>
+          <w:tcPr>
+            <w:tcW w:type="dxa" w:w="3041"/>
+          </w:tcPr>
+          <w:p>
+            <w:r>
+              <w:t>MODIFICADO</w:t>
+            </w:r>
+          </w:p>
+        </w:tc>
+        <w:tc>
+          <w:tcPr>
+            <w:tcW w:type="dxa" w:w="3041"/>
+          </w:tcPr>
+          <w:p>
+            <w:r>
+              <w:t>Handler GetClusterStatus + RemoveDir pasa flag recursive</w:t>
+            </w:r>
+          </w:p>
+        </w:tc>
+      </w:tr>
+      <w:tr>
+        <w:tc>
+          <w:tcPr>
+            <w:tcW w:type="dxa" w:w="3041"/>
+          </w:tcPr>
+          <w:p>
+            <w:r>
+              <w:t>namenode/namespace_manager.py</w:t>
+            </w:r>
+          </w:p>
+        </w:tc>
+        <w:tc>
+          <w:tcPr>
+            <w:tcW w:type="dxa" w:w="3041"/>
+          </w:tcPr>
+          <w:p>
+            <w:r>
+              <w:t>MODIFICADO</w:t>
+            </w:r>
+          </w:p>
+        </w:tc>
+        <w:tc>
+          <w:tcPr>
+            <w:tcW w:type="dxa" w:w="3041"/>
+          </w:tcPr>
+          <w:p>
+            <w:r>
+              <w:t>remove_dir soporta recursive; nuevo _remove_dir_recursive()</w:t>
+            </w:r>
+          </w:p>
+        </w:tc>
+      </w:tr>
+      <w:tr>
+        <w:tc>
+          <w:tcPr>
+            <w:tcW w:type="dxa" w:w="3041"/>
+          </w:tcPr>
+          <w:p>
+            <w:r>
+              <w:t>namenode/metadata_store.py</w:t>
+            </w:r>
+          </w:p>
+        </w:tc>
+        <w:tc>
+          <w:tcPr>
+            <w:tcW w:type="dxa" w:w="3041"/>
+          </w:tcPr>
+          <w:p>
+            <w:r>
+              <w:t>MODIFICADO</w:t>
+            </w:r>
+          </w:p>
+        </w:tc>
+        <w:tc>
+          <w:tcPr>
+            <w:tcW w:type="dxa" w:w="3041"/>
+          </w:tcPr>
+          <w:p>
+            <w:r>
+              <w:t>4 nuevos métodos: list_all_files_under, list_all_dirs_under, get_total_file_count, get_total_block_count</w:t>
+            </w:r>
+          </w:p>
+        </w:tc>
+      </w:tr>
+      <w:tr>
+        <w:tc>
+          <w:tcPr>
+            <w:tcW w:type="dxa" w:w="3041"/>
+          </w:tcPr>
+          <w:p>
+            <w:r>
+              <w:t>client/cli.py</w:t>
+            </w:r>
+          </w:p>
+        </w:tc>
+        <w:tc>
+          <w:tcPr>
+            <w:tcW w:type="dxa" w:w="3041"/>
+          </w:tcPr>
+          <w:p>
+            <w:r>
+              <w:t>MODIFICADO</w:t>
+            </w:r>
+          </w:p>
+        </w:tc>
+        <w:tc>
+          <w:tcPr>
+            <w:tcW w:type="dxa" w:w="3041"/>
+          </w:tcPr>
+          <w:p>
+            <w:r>
+              <w:t>Comando status completo + flag -r en rmdir + header limpiado</w:t>
+            </w:r>
+          </w:p>
+        </w:tc>
+      </w:tr>
+    </w:tbl>
+    <w:p/>
+    <w:p>
+      <w:pPr>
+        <w:spacing w:after="100"/>
+      </w:pPr>
+      <w:r>
+        <w:rPr>
+          <w:b w:val="0"/>
+          <w:i/>
+          <w:color w:val="475569"/>
+          <w:sz w:val="22"/>
+        </w:rPr>
+        <w:t>Todos los cambios fueron versionados en el repositorio GitHub con el commit c864f69 bajo el mensaje 'feat: status command + rmdir -r + GetClusterStatus RPC'.</w:t>
+      </w:r>
+    </w:p>
     <w:sectPr>
       <w:pgSz w:w="12240" w:h="15840"/>
       <w:pgMar w:top="1417" w:right="1417" w:bottom="1417" w:left="1701" w:header="720" w:footer="720" w:gutter="0"/>

</xml_diff>

<commit_message>
chore: sync docx locales
</commit_message>
<xml_diff>
--- a/Informe_Tecnico_Grupal_MiniDFS.docx
+++ b/Informe_Tecnico_Grupal_MiniDFS.docx
@@ -153,436 +153,65 @@
         </w:rPr>
       </w:pPr>
     </w:p>
-    <w:tbl>
-      <w:tblPr>
-        <w:tblStyle w:val="Sombreadoclaro-nfasis1"/>
-        <w:tblW w:w="0" w:type="auto"/>
-        <w:tblLook w:val="04A0" w:firstRow="1" w:lastRow="0" w:firstColumn="1" w:lastColumn="0" w:noHBand="0" w:noVBand="1"/>
-      </w:tblPr>
-      <w:tblGrid>
-        <w:gridCol w:w="4561"/>
-        <w:gridCol w:w="4561"/>
-      </w:tblGrid>
-      <w:tr>
-        <w:trPr>
-          <w:cnfStyle w:val="100000000000" w:firstRow="1" w:lastRow="0" w:firstColumn="0" w:lastColumn="0" w:oddVBand="0" w:evenVBand="0" w:oddHBand="0" w:evenHBand="0" w:firstRowFirstColumn="0" w:firstRowLastColumn="0" w:lastRowFirstColumn="0" w:lastRowLastColumn="0"/>
-        </w:trPr>
-        <w:tc>
-          <w:tcPr>
-            <w:cnfStyle w:val="001000000000" w:firstRow="0" w:lastRow="0" w:firstColumn="1" w:lastColumn="0" w:oddVBand="0" w:evenVBand="0" w:oddHBand="0" w:evenHBand="0" w:firstRowFirstColumn="0" w:firstRowLastColumn="0" w:lastRowFirstColumn="0" w:lastRowLastColumn="0"/>
-            <w:tcW w:w="4561" w:type="dxa"/>
-            <w:shd w:val="clear" w:color="auto" w:fill="0F766E"/>
-          </w:tcPr>
-          <w:p>
-            <w:pPr>
-              <w:rPr>
-                <w:rFonts w:ascii="Arial" w:hAnsi="Arial" w:cs="Arial"/>
-                <w:sz w:val="24"/>
-                <w:szCs w:val="24"/>
-              </w:rPr>
-            </w:pPr>
-            <w:r>
-              <w:rPr>
-                <w:rFonts w:ascii="Arial" w:hAnsi="Arial" w:cs="Arial"/>
-                <w:color w:val="FFFFFF"/>
-                <w:sz w:val="24"/>
-                <w:szCs w:val="24"/>
-              </w:rPr>
-              <w:t>Campo</w:t>
-            </w:r>
-          </w:p>
-        </w:tc>
-        <w:tc>
-          <w:tcPr>
-            <w:tcW w:w="4561" w:type="dxa"/>
-            <w:shd w:val="clear" w:color="auto" w:fill="0F766E"/>
-          </w:tcPr>
-          <w:p>
-            <w:pPr>
-              <w:cnfStyle w:val="100000000000" w:firstRow="1" w:lastRow="0" w:firstColumn="0" w:lastColumn="0" w:oddVBand="0" w:evenVBand="0" w:oddHBand="0" w:evenHBand="0" w:firstRowFirstColumn="0" w:firstRowLastColumn="0" w:lastRowFirstColumn="0" w:lastRowLastColumn="0"/>
-              <w:rPr>
-                <w:rFonts w:ascii="Arial" w:hAnsi="Arial" w:cs="Arial"/>
-                <w:sz w:val="24"/>
-                <w:szCs w:val="24"/>
-              </w:rPr>
-            </w:pPr>
-            <w:r>
-              <w:rPr>
-                <w:rFonts w:ascii="Arial" w:hAnsi="Arial" w:cs="Arial"/>
-                <w:color w:val="FFFFFF"/>
-                <w:sz w:val="24"/>
-                <w:szCs w:val="24"/>
-              </w:rPr>
-              <w:t>Detalle</w:t>
-            </w:r>
-          </w:p>
-        </w:tc>
-      </w:tr>
-      <w:tr>
-        <w:trPr>
-          <w:cnfStyle w:val="000000100000" w:firstRow="0" w:lastRow="0" w:firstColumn="0" w:lastColumn="0" w:oddVBand="0" w:evenVBand="0" w:oddHBand="1" w:evenHBand="0" w:firstRowFirstColumn="0" w:firstRowLastColumn="0" w:lastRowFirstColumn="0" w:lastRowLastColumn="0"/>
-        </w:trPr>
-        <w:tc>
-          <w:tcPr>
-            <w:cnfStyle w:val="001000000000" w:firstRow="0" w:lastRow="0" w:firstColumn="1" w:lastColumn="0" w:oddVBand="0" w:evenVBand="0" w:oddHBand="0" w:evenHBand="0" w:firstRowFirstColumn="0" w:firstRowLastColumn="0" w:lastRowFirstColumn="0" w:lastRowLastColumn="0"/>
-            <w:tcW w:w="4561" w:type="dxa"/>
-          </w:tcPr>
-          <w:p>
-            <w:pPr>
-              <w:rPr>
-                <w:rFonts w:ascii="Arial" w:hAnsi="Arial" w:cs="Arial"/>
-                <w:sz w:val="24"/>
-                <w:szCs w:val="24"/>
-              </w:rPr>
-            </w:pPr>
-            <w:r>
-              <w:rPr>
-                <w:rFonts w:ascii="Arial" w:hAnsi="Arial" w:cs="Arial"/>
-                <w:sz w:val="24"/>
-                <w:szCs w:val="24"/>
-              </w:rPr>
-              <w:t>Estudiante</w:t>
-            </w:r>
-          </w:p>
-        </w:tc>
-        <w:tc>
-          <w:tcPr>
-            <w:tcW w:w="4561" w:type="dxa"/>
-          </w:tcPr>
-          <w:p>
-            <w:pPr>
-              <w:cnfStyle w:val="000000100000" w:firstRow="0" w:lastRow="0" w:firstColumn="0" w:lastColumn="0" w:oddVBand="0" w:evenVBand="0" w:oddHBand="1" w:evenHBand="0" w:firstRowFirstColumn="0" w:firstRowLastColumn="0" w:lastRowFirstColumn="0" w:lastRowLastColumn="0"/>
-              <w:rPr>
-                <w:rFonts w:ascii="Arial" w:hAnsi="Arial" w:cs="Arial"/>
-                <w:sz w:val="24"/>
-                <w:szCs w:val="24"/>
-              </w:rPr>
-            </w:pPr>
-            <w:r>
-              <w:rPr>
-                <w:rFonts w:ascii="Arial" w:hAnsi="Arial" w:cs="Arial"/>
-                <w:sz w:val="24"/>
-                <w:szCs w:val="24"/>
-              </w:rPr>
-              <w:t xml:space="preserve">Andrés Felipe </w:t>
-            </w:r>
-            <w:r>
-              <w:rPr>
-                <w:rFonts w:ascii="Arial" w:hAnsi="Arial" w:cs="Arial"/>
-                <w:sz w:val="24"/>
-                <w:szCs w:val="24"/>
-              </w:rPr>
-              <w:t>N</w:t>
-            </w:r>
-            <w:r>
-              <w:rPr>
-                <w:rFonts w:ascii="Arial" w:hAnsi="Arial" w:cs="Arial"/>
-                <w:sz w:val="24"/>
-                <w:szCs w:val="24"/>
-              </w:rPr>
-              <w:t>u</w:t>
-            </w:r>
-            <w:r>
-              <w:rPr>
-                <w:rFonts w:ascii="Arial" w:hAnsi="Arial" w:cs="Arial"/>
-                <w:sz w:val="24"/>
-                <w:szCs w:val="24"/>
-              </w:rPr>
-              <w:t>ñez</w:t>
-            </w:r>
-            <w:r>
-              <w:rPr>
-                <w:rFonts w:ascii="Arial" w:hAnsi="Arial" w:cs="Arial"/>
-                <w:sz w:val="24"/>
-                <w:szCs w:val="24"/>
-              </w:rPr>
-              <w:t xml:space="preserve"> Hernandez</w:t>
-            </w:r>
-          </w:p>
-        </w:tc>
-      </w:tr>
-      <w:tr>
-        <w:tc>
-          <w:tcPr>
-            <w:cnfStyle w:val="001000000000" w:firstRow="0" w:lastRow="0" w:firstColumn="1" w:lastColumn="0" w:oddVBand="0" w:evenVBand="0" w:oddHBand="0" w:evenHBand="0" w:firstRowFirstColumn="0" w:firstRowLastColumn="0" w:lastRowFirstColumn="0" w:lastRowLastColumn="0"/>
-            <w:tcW w:w="4561" w:type="dxa"/>
-          </w:tcPr>
-          <w:p>
-            <w:pPr>
-              <w:rPr>
-                <w:rFonts w:ascii="Arial" w:hAnsi="Arial" w:cs="Arial"/>
-                <w:sz w:val="24"/>
-                <w:szCs w:val="24"/>
-              </w:rPr>
-            </w:pPr>
-            <w:r>
-              <w:rPr>
-                <w:rFonts w:ascii="Arial" w:hAnsi="Arial" w:cs="Arial"/>
-                <w:sz w:val="24"/>
-                <w:szCs w:val="24"/>
-              </w:rPr>
-              <w:t>Materia</w:t>
-            </w:r>
-          </w:p>
-        </w:tc>
-        <w:tc>
-          <w:tcPr>
-            <w:tcW w:w="4561" w:type="dxa"/>
-          </w:tcPr>
-          <w:p>
-            <w:pPr>
-              <w:cnfStyle w:val="000000000000" w:firstRow="0" w:lastRow="0" w:firstColumn="0" w:lastColumn="0" w:oddVBand="0" w:evenVBand="0" w:oddHBand="0" w:evenHBand="0" w:firstRowFirstColumn="0" w:firstRowLastColumn="0" w:lastRowFirstColumn="0" w:lastRowLastColumn="0"/>
-              <w:rPr>
-                <w:rFonts w:ascii="Arial" w:hAnsi="Arial" w:cs="Arial"/>
-                <w:sz w:val="24"/>
-                <w:szCs w:val="24"/>
-                <w:lang w:val="es-CO"/>
-              </w:rPr>
-            </w:pPr>
-            <w:r>
-              <w:rPr>
-                <w:rFonts w:ascii="Arial" w:hAnsi="Arial" w:cs="Arial"/>
-                <w:sz w:val="24"/>
-                <w:szCs w:val="24"/>
-                <w:lang w:val="es-CO"/>
-              </w:rPr>
-              <w:t>Arquitectura de Nube y Sistemas Distribuidos</w:t>
-            </w:r>
-          </w:p>
-        </w:tc>
-      </w:tr>
-      <w:tr>
-        <w:trPr>
-          <w:cnfStyle w:val="000000100000" w:firstRow="0" w:lastRow="0" w:firstColumn="0" w:lastColumn="0" w:oddVBand="0" w:evenVBand="0" w:oddHBand="1" w:evenHBand="0" w:firstRowFirstColumn="0" w:firstRowLastColumn="0" w:lastRowFirstColumn="0" w:lastRowLastColumn="0"/>
-        </w:trPr>
-        <w:tc>
-          <w:tcPr>
-            <w:cnfStyle w:val="001000000000" w:firstRow="0" w:lastRow="0" w:firstColumn="1" w:lastColumn="0" w:oddVBand="0" w:evenVBand="0" w:oddHBand="0" w:evenHBand="0" w:firstRowFirstColumn="0" w:firstRowLastColumn="0" w:lastRowFirstColumn="0" w:lastRowLastColumn="0"/>
-            <w:tcW w:w="4561" w:type="dxa"/>
-          </w:tcPr>
-          <w:p>
-            <w:pPr>
-              <w:rPr>
-                <w:rFonts w:ascii="Arial" w:hAnsi="Arial" w:cs="Arial"/>
-                <w:sz w:val="24"/>
-                <w:szCs w:val="24"/>
-              </w:rPr>
-            </w:pPr>
-            <w:proofErr w:type="spellStart"/>
-            <w:r>
-              <w:rPr>
-                <w:rFonts w:ascii="Arial" w:hAnsi="Arial" w:cs="Arial"/>
-                <w:sz w:val="24"/>
-                <w:szCs w:val="24"/>
-              </w:rPr>
-              <w:t>Docente</w:t>
-            </w:r>
-            <w:proofErr w:type="spellEnd"/>
-          </w:p>
-        </w:tc>
-        <w:tc>
-          <w:tcPr>
-            <w:tcW w:w="4561" w:type="dxa"/>
-          </w:tcPr>
-          <w:p>
-            <w:pPr>
-              <w:cnfStyle w:val="000000100000" w:firstRow="0" w:lastRow="0" w:firstColumn="0" w:lastColumn="0" w:oddVBand="0" w:evenVBand="0" w:oddHBand="1" w:evenHBand="0" w:firstRowFirstColumn="0" w:firstRowLastColumn="0" w:lastRowFirstColumn="0" w:lastRowLastColumn="0"/>
-              <w:rPr>
-                <w:rFonts w:ascii="Arial" w:hAnsi="Arial" w:cs="Arial"/>
-                <w:sz w:val="24"/>
-                <w:szCs w:val="24"/>
-              </w:rPr>
-            </w:pPr>
-            <w:r>
-              <w:rPr>
-                <w:rFonts w:ascii="Arial" w:hAnsi="Arial" w:cs="Arial"/>
-                <w:sz w:val="24"/>
-                <w:szCs w:val="24"/>
-              </w:rPr>
-              <w:t>Álvaro Ospina Sanjuan</w:t>
-            </w:r>
-          </w:p>
-        </w:tc>
-      </w:tr>
-      <w:tr>
-        <w:tc>
-          <w:tcPr>
-            <w:cnfStyle w:val="001000000000" w:firstRow="0" w:lastRow="0" w:firstColumn="1" w:lastColumn="0" w:oddVBand="0" w:evenVBand="0" w:oddHBand="0" w:evenHBand="0" w:firstRowFirstColumn="0" w:firstRowLastColumn="0" w:lastRowFirstColumn="0" w:lastRowLastColumn="0"/>
-            <w:tcW w:w="4561" w:type="dxa"/>
-          </w:tcPr>
-          <w:p>
-            <w:pPr>
-              <w:rPr>
-                <w:rFonts w:ascii="Arial" w:hAnsi="Arial" w:cs="Arial"/>
-                <w:sz w:val="24"/>
-                <w:szCs w:val="24"/>
-              </w:rPr>
-            </w:pPr>
-            <w:r>
-              <w:rPr>
-                <w:rFonts w:ascii="Arial" w:hAnsi="Arial" w:cs="Arial"/>
-                <w:sz w:val="24"/>
-                <w:szCs w:val="24"/>
-              </w:rPr>
-              <w:t>Universidad</w:t>
-            </w:r>
-          </w:p>
-        </w:tc>
-        <w:tc>
-          <w:tcPr>
-            <w:tcW w:w="4561" w:type="dxa"/>
-          </w:tcPr>
-          <w:p>
-            <w:pPr>
-              <w:cnfStyle w:val="000000000000" w:firstRow="0" w:lastRow="0" w:firstColumn="0" w:lastColumn="0" w:oddVBand="0" w:evenVBand="0" w:oddHBand="0" w:evenHBand="0" w:firstRowFirstColumn="0" w:firstRowLastColumn="0" w:lastRowFirstColumn="0" w:lastRowLastColumn="0"/>
-              <w:rPr>
-                <w:rFonts w:ascii="Arial" w:hAnsi="Arial" w:cs="Arial"/>
-                <w:sz w:val="24"/>
-                <w:szCs w:val="24"/>
-              </w:rPr>
-            </w:pPr>
-            <w:r>
-              <w:rPr>
-                <w:rFonts w:ascii="Arial" w:hAnsi="Arial" w:cs="Arial"/>
-                <w:sz w:val="24"/>
-                <w:szCs w:val="24"/>
-              </w:rPr>
-              <w:t>Universidad Pontificia Bolivariana</w:t>
-            </w:r>
-          </w:p>
-        </w:tc>
-      </w:tr>
-      <w:tr>
-        <w:trPr>
-          <w:cnfStyle w:val="000000100000" w:firstRow="0" w:lastRow="0" w:firstColumn="0" w:lastColumn="0" w:oddVBand="0" w:evenVBand="0" w:oddHBand="1" w:evenHBand="0" w:firstRowFirstColumn="0" w:firstRowLastColumn="0" w:lastRowFirstColumn="0" w:lastRowLastColumn="0"/>
-        </w:trPr>
-        <w:tc>
-          <w:tcPr>
-            <w:cnfStyle w:val="001000000000" w:firstRow="0" w:lastRow="0" w:firstColumn="1" w:lastColumn="0" w:oddVBand="0" w:evenVBand="0" w:oddHBand="0" w:evenHBand="0" w:firstRowFirstColumn="0" w:firstRowLastColumn="0" w:lastRowFirstColumn="0" w:lastRowLastColumn="0"/>
-            <w:tcW w:w="4561" w:type="dxa"/>
-          </w:tcPr>
-          <w:p>
-            <w:pPr>
-              <w:rPr>
-                <w:rFonts w:ascii="Arial" w:hAnsi="Arial" w:cs="Arial"/>
-                <w:sz w:val="24"/>
-                <w:szCs w:val="24"/>
-              </w:rPr>
-            </w:pPr>
-            <w:r>
-              <w:rPr>
-                <w:rFonts w:ascii="Arial" w:hAnsi="Arial" w:cs="Arial"/>
-                <w:sz w:val="24"/>
-                <w:szCs w:val="24"/>
-              </w:rPr>
-              <w:t>Fecha</w:t>
-            </w:r>
-          </w:p>
-        </w:tc>
-        <w:tc>
-          <w:tcPr>
-            <w:tcW w:w="4561" w:type="dxa"/>
-          </w:tcPr>
-          <w:p>
-            <w:pPr>
-              <w:cnfStyle w:val="000000100000" w:firstRow="0" w:lastRow="0" w:firstColumn="0" w:lastColumn="0" w:oddVBand="0" w:evenVBand="0" w:oddHBand="1" w:evenHBand="0" w:firstRowFirstColumn="0" w:firstRowLastColumn="0" w:lastRowFirstColumn="0" w:lastRowLastColumn="0"/>
-              <w:rPr>
-                <w:rFonts w:ascii="Arial" w:hAnsi="Arial" w:cs="Arial"/>
-                <w:sz w:val="24"/>
-                <w:szCs w:val="24"/>
-              </w:rPr>
-            </w:pPr>
-            <w:r>
-              <w:rPr>
-                <w:rFonts w:ascii="Arial" w:hAnsi="Arial" w:cs="Arial"/>
-                <w:sz w:val="24"/>
-                <w:szCs w:val="24"/>
-              </w:rPr>
-              <w:t>Mayo 2026</w:t>
-            </w:r>
-          </w:p>
-        </w:tc>
-      </w:tr>
-      <w:tr>
-        <w:tc>
-          <w:tcPr>
-            <w:cnfStyle w:val="001000000000" w:firstRow="0" w:lastRow="0" w:firstColumn="1" w:lastColumn="0" w:oddVBand="0" w:evenVBand="0" w:oddHBand="0" w:evenHBand="0" w:firstRowFirstColumn="0" w:firstRowLastColumn="0" w:lastRowFirstColumn="0" w:lastRowLastColumn="0"/>
-            <w:tcW w:w="4561" w:type="dxa"/>
-          </w:tcPr>
-          <w:p>
-            <w:pPr>
-              <w:rPr>
-                <w:rFonts w:ascii="Arial" w:hAnsi="Arial" w:cs="Arial"/>
-                <w:sz w:val="24"/>
-                <w:szCs w:val="24"/>
-              </w:rPr>
-            </w:pPr>
-            <w:r>
-              <w:rPr>
-                <w:rFonts w:ascii="Arial" w:hAnsi="Arial" w:cs="Arial"/>
-                <w:sz w:val="24"/>
-                <w:szCs w:val="24"/>
-              </w:rPr>
-              <w:t>Repositorio</w:t>
-            </w:r>
-          </w:p>
-        </w:tc>
-        <w:tc>
-          <w:tcPr>
-            <w:tcW w:w="4561" w:type="dxa"/>
-          </w:tcPr>
-          <w:p>
-            <w:pPr>
-              <w:cnfStyle w:val="000000000000" w:firstRow="0" w:lastRow="0" w:firstColumn="0" w:lastColumn="0" w:oddVBand="0" w:evenVBand="0" w:oddHBand="0" w:evenHBand="0" w:firstRowFirstColumn="0" w:firstRowLastColumn="0" w:lastRowFirstColumn="0" w:lastRowLastColumn="0"/>
-              <w:rPr>
-                <w:rFonts w:ascii="Arial" w:hAnsi="Arial" w:cs="Arial"/>
-                <w:sz w:val="24"/>
-                <w:szCs w:val="24"/>
-                <w:lang w:val="es-CO"/>
-              </w:rPr>
-            </w:pPr>
-            <w:r>
-              <w:rPr>
-                <w:rFonts w:ascii="Arial" w:hAnsi="Arial" w:cs="Arial"/>
-                <w:sz w:val="24"/>
-                <w:szCs w:val="24"/>
-                <w:lang w:val="es-CO"/>
-              </w:rPr>
-              <w:t>github.com/</w:t>
-            </w:r>
-            <w:proofErr w:type="spellStart"/>
-            <w:r>
-              <w:rPr>
-                <w:rFonts w:ascii="Arial" w:hAnsi="Arial" w:cs="Arial"/>
-                <w:sz w:val="24"/>
-                <w:szCs w:val="24"/>
-                <w:lang w:val="es-CO"/>
-              </w:rPr>
-              <w:t>Perrpo</w:t>
-            </w:r>
-            <w:proofErr w:type="spellEnd"/>
-            <w:r>
-              <w:rPr>
-                <w:rFonts w:ascii="Arial" w:hAnsi="Arial" w:cs="Arial"/>
-                <w:sz w:val="24"/>
-                <w:szCs w:val="24"/>
-                <w:lang w:val="es-CO"/>
-              </w:rPr>
-              <w:t>/Proyecto-DFS-Sistemas-distribuidos</w:t>
-            </w:r>
-          </w:p>
-        </w:tc>
-      </w:tr>
-    </w:tbl>
     <w:p>
       <w:pPr>
-        <w:rPr>
-          <w:rFonts w:ascii="Arial" w:hAnsi="Arial" w:cs="Arial"/>
-          <w:sz w:val="24"/>
-          <w:szCs w:val="24"/>
-          <w:lang w:val="es-CO"/>
-        </w:rPr>
-      </w:pPr>
+        <w:jc w:val="center"/>
+        <w:rPr>
+          <w:rFonts w:ascii="Arial" w:hAnsi="Arial" w:cs="Arial"/>
+          <w:sz w:val="24"/>
+          <w:szCs w:val="24"/>
+          <w:lang w:val="es-CO"/>
+        </w:rPr>
+      </w:pPr>
+      <w:r>
+        <w:rPr>
+          <w:rFonts w:ascii="Arial" w:hAnsi="Arial" w:cs="Arial"/>
+          <w:sz w:val="24"/>
+          <w:szCs w:val="24"/>
+          <w:lang w:val="es-CO"/>
+        </w:rPr>
+        <w:t>Estudiante: Andrés Felipe Núñez Hernández</w:t>
+      </w:r>
+    </w:p>
+    <w:p>
+      <w:pPr>
+        <w:jc w:val="center"/>
+        <w:rPr>
+          <w:rFonts w:ascii="Arial" w:hAnsi="Arial" w:cs="Arial"/>
+          <w:sz w:val="24"/>
+          <w:szCs w:val="24"/>
+          <w:lang w:val="es-CO"/>
+        </w:rPr>
+      </w:pPr>
+      <w:r>
+        <w:rPr>
+          <w:rFonts w:ascii="Arial" w:hAnsi="Arial" w:cs="Arial"/>
+          <w:sz w:val="24"/>
+          <w:szCs w:val="24"/>
+          <w:lang w:val="es-CO"/>
+        </w:rPr>
+        <w:t>Asignatura: Arquitecturas de Nube y Sistemas Distribuidos</w:t>
+      </w:r>
+    </w:p>
+    <w:p>
+      <w:pPr>
+        <w:jc w:val="center"/>
+        <w:rPr>
+          <w:rFonts w:ascii="Arial" w:hAnsi="Arial" w:cs="Arial"/>
+          <w:sz w:val="24"/>
+          <w:szCs w:val="24"/>
+          <w:lang w:val="es-CO"/>
+        </w:rPr>
+      </w:pPr>
+      <w:r>
+        <w:rPr>
+          <w:rFonts w:ascii="Arial" w:hAnsi="Arial" w:cs="Arial"/>
+          <w:sz w:val="24"/>
+          <w:szCs w:val="24"/>
+          <w:lang w:val="es-CO"/>
+        </w:rPr>
+        <w:t>Universidad Pontificia Bolivariana – 2026</w:t>
+      </w:r>
     </w:p>
     <w:p>
       <w:pPr>
@@ -4205,6 +3834,7 @@
       <w:r>
         <w:rPr>
           <w:rFonts w:ascii="Arial" w:hAnsi="Arial" w:cs="Arial"/>
+          <w:noProof/>
           <w:color w:val="1E40AF"/>
           <w:sz w:val="24"/>
           <w:szCs w:val="24"/>
@@ -6333,8 +5963,19 @@
           <w:sz w:val="24"/>
           <w:szCs w:val="24"/>
         </w:rPr>
-        <w:t>: gRPC</w:t>
-      </w:r>
+        <w:t xml:space="preserve">: </w:t>
+      </w:r>
+      <w:proofErr w:type="spellStart"/>
+      <w:r>
+        <w:rPr>
+          <w:rFonts w:ascii="Arial" w:hAnsi="Arial" w:cs="Arial"/>
+          <w:color w:val="0F766E"/>
+          <w:sz w:val="24"/>
+          <w:szCs w:val="24"/>
+        </w:rPr>
+        <w:t>gRPC</w:t>
+      </w:r>
+      <w:proofErr w:type="spellEnd"/>
     </w:p>
     <w:p>
       <w:pPr>
@@ -6436,7 +6077,25 @@
           <w:sz w:val="24"/>
           <w:szCs w:val="24"/>
         </w:rPr>
-        <w:t xml:space="preserve"> sobre REST se justifica por:</w:t>
+        <w:t xml:space="preserve"> </w:t>
+      </w:r>
+      <w:proofErr w:type="spellStart"/>
+      <w:r>
+        <w:rPr>
+          <w:rFonts w:ascii="Arial" w:hAnsi="Arial" w:cs="Arial"/>
+          <w:sz w:val="24"/>
+          <w:szCs w:val="24"/>
+        </w:rPr>
+        <w:t>sobre</w:t>
+      </w:r>
+      <w:proofErr w:type="spellEnd"/>
+      <w:r>
+        <w:rPr>
+          <w:rFonts w:ascii="Arial" w:hAnsi="Arial" w:cs="Arial"/>
+          <w:sz w:val="24"/>
+          <w:szCs w:val="24"/>
+        </w:rPr>
+        <w:t xml:space="preserve"> REST se justifica por:</w:t>
       </w:r>
     </w:p>
     <w:p>
@@ -9168,7 +8827,6 @@
           <w:rFonts w:ascii="Arial" w:hAnsi="Arial" w:cs="Arial"/>
           <w:sz w:val="24"/>
           <w:szCs w:val="24"/>
-          <w:lang w:val="es-CO"/>
         </w:rPr>
       </w:pPr>
       <w:r>
@@ -9180,6 +8838,15 @@
         </w:rPr>
         <w:t xml:space="preserve">  </w:t>
       </w:r>
+      <w:r>
+        <w:rPr>
+          <w:rFonts w:ascii="Arial" w:hAnsi="Arial" w:cs="Arial"/>
+          <w:color w:val="1E40AF"/>
+          <w:sz w:val="24"/>
+          <w:szCs w:val="24"/>
+        </w:rPr>
+        <w:t xml:space="preserve">repeated </w:t>
+      </w:r>
       <w:proofErr w:type="spellStart"/>
       <w:r>
         <w:rPr>
@@ -9187,9 +8854,8 @@
           <w:color w:val="1E40AF"/>
           <w:sz w:val="24"/>
           <w:szCs w:val="24"/>
-          <w:lang w:val="es-CO"/>
-        </w:rPr>
-        <w:t>repeated</w:t>
+        </w:rPr>
+        <w:t>DataNodeInfo</w:t>
       </w:r>
       <w:proofErr w:type="spellEnd"/>
       <w:r>
@@ -9198,7 +8864,6 @@
           <w:color w:val="1E40AF"/>
           <w:sz w:val="24"/>
           <w:szCs w:val="24"/>
-          <w:lang w:val="es-CO"/>
         </w:rPr>
         <w:t xml:space="preserve"> </w:t>
       </w:r>
@@ -9209,9 +8874,8 @@
           <w:color w:val="1E40AF"/>
           <w:sz w:val="24"/>
           <w:szCs w:val="24"/>
-          <w:lang w:val="es-CO"/>
-        </w:rPr>
-        <w:t>DataNodeInfo</w:t>
+        </w:rPr>
+        <w:t>datanodes</w:t>
       </w:r>
       <w:proofErr w:type="spellEnd"/>
       <w:r>
@@ -9220,9 +8884,8 @@
           <w:color w:val="1E40AF"/>
           <w:sz w:val="24"/>
           <w:szCs w:val="24"/>
-          <w:lang w:val="es-CO"/>
-        </w:rPr>
-        <w:t xml:space="preserve"> </w:t>
+        </w:rPr>
+        <w:t xml:space="preserve"> = 4; // pipeline: primer </w:t>
       </w:r>
       <w:proofErr w:type="spellStart"/>
       <w:r>
@@ -9231,9 +8894,8 @@
           <w:color w:val="1E40AF"/>
           <w:sz w:val="24"/>
           <w:szCs w:val="24"/>
-          <w:lang w:val="es-CO"/>
-        </w:rPr>
-        <w:t>datanodes</w:t>
+        </w:rPr>
+        <w:t>nodo</w:t>
       </w:r>
       <w:proofErr w:type="spellEnd"/>
       <w:r>
@@ -9242,10 +8904,20 @@
           <w:color w:val="1E40AF"/>
           <w:sz w:val="24"/>
           <w:szCs w:val="24"/>
-          <w:lang w:val="es-CO"/>
-        </w:rPr>
-        <w:t xml:space="preserve"> = 4; // pipeline: primer nodo = primario</w:t>
-      </w:r>
+        </w:rPr>
+        <w:t xml:space="preserve"> = </w:t>
+      </w:r>
+      <w:proofErr w:type="spellStart"/>
+      <w:r>
+        <w:rPr>
+          <w:rFonts w:ascii="Arial" w:hAnsi="Arial" w:cs="Arial"/>
+          <w:color w:val="1E40AF"/>
+          <w:sz w:val="24"/>
+          <w:szCs w:val="24"/>
+        </w:rPr>
+        <w:t>primario</w:t>
+      </w:r>
+      <w:proofErr w:type="spellEnd"/>
     </w:p>
     <w:p>
       <w:pPr>
@@ -13406,7 +13078,27 @@
           <w:sz w:val="24"/>
           <w:szCs w:val="24"/>
         </w:rPr>
-        <w:t xml:space="preserve"> -I /app --python_out=/app --grpc_python_out=/app /app/proto/dfs.proto</w:t>
+        <w:t xml:space="preserve"> -I /app --</w:t>
+      </w:r>
+      <w:proofErr w:type="spellStart"/>
+      <w:r>
+        <w:rPr>
+          <w:rFonts w:ascii="Arial" w:hAnsi="Arial" w:cs="Arial"/>
+          <w:color w:val="1E40AF"/>
+          <w:sz w:val="24"/>
+          <w:szCs w:val="24"/>
+        </w:rPr>
+        <w:t>python_out</w:t>
+      </w:r>
+      <w:proofErr w:type="spellEnd"/>
+      <w:r>
+        <w:rPr>
+          <w:rFonts w:ascii="Arial" w:hAnsi="Arial" w:cs="Arial"/>
+          <w:color w:val="1E40AF"/>
+          <w:sz w:val="24"/>
+          <w:szCs w:val="24"/>
+        </w:rPr>
+        <w:t>=/app --grpc_python_out=/app /app/proto/dfs.proto</w:t>
       </w:r>
     </w:p>
     <w:p>
@@ -15707,6 +15399,7 @@
       <w:r>
         <w:rPr>
           <w:rFonts w:ascii="Arial" w:hAnsi="Arial" w:cs="Arial"/>
+          <w:noProof/>
           <w:color w:val="1E40AF"/>
           <w:sz w:val="24"/>
           <w:szCs w:val="24"/>
@@ -16008,25 +15701,7 @@
                 <w:sz w:val="24"/>
                 <w:szCs w:val="24"/>
               </w:rPr>
-              <w:t xml:space="preserve">Token </w:t>
-            </w:r>
-            <w:proofErr w:type="spellStart"/>
-            <w:r>
-              <w:rPr>
-                <w:rFonts w:ascii="Arial" w:hAnsi="Arial" w:cs="Arial"/>
-                <w:sz w:val="24"/>
-                <w:szCs w:val="24"/>
-              </w:rPr>
-              <w:t>en</w:t>
-            </w:r>
-            <w:proofErr w:type="spellEnd"/>
-            <w:r>
-              <w:rPr>
-                <w:rFonts w:ascii="Arial" w:hAnsi="Arial" w:cs="Arial"/>
-                <w:sz w:val="24"/>
-                <w:szCs w:val="24"/>
-              </w:rPr>
-              <w:t xml:space="preserve"> requests</w:t>
+              <w:t>Token en requests</w:t>
             </w:r>
           </w:p>
         </w:tc>
@@ -16214,6 +15889,7 @@
       <w:r>
         <w:rPr>
           <w:rFonts w:ascii="Arial" w:hAnsi="Arial" w:cs="Arial"/>
+          <w:noProof/>
           <w:color w:val="1E40AF"/>
           <w:sz w:val="24"/>
           <w:szCs w:val="24"/>
@@ -16688,6 +16364,7 @@
       <w:r>
         <w:rPr>
           <w:rFonts w:ascii="Arial" w:hAnsi="Arial" w:cs="Arial"/>
+          <w:noProof/>
           <w:color w:val="1E40AF"/>
           <w:sz w:val="24"/>
           <w:szCs w:val="24"/>
@@ -17070,6 +16747,7 @@
       <w:r>
         <w:rPr>
           <w:rFonts w:ascii="Arial" w:hAnsi="Arial" w:cs="Arial"/>
+          <w:noProof/>
           <w:sz w:val="24"/>
           <w:szCs w:val="24"/>
         </w:rPr>
@@ -17596,6 +17274,7 @@
       <w:r>
         <w:rPr>
           <w:rFonts w:ascii="Arial" w:hAnsi="Arial" w:cs="Arial"/>
+          <w:noProof/>
           <w:sz w:val="24"/>
           <w:szCs w:val="24"/>
           <w:lang w:val="es-CO"/>
@@ -18074,6 +17753,7 @@
       <w:r>
         <w:rPr>
           <w:rFonts w:ascii="Arial" w:hAnsi="Arial" w:cs="Arial"/>
+          <w:noProof/>
           <w:sz w:val="24"/>
           <w:szCs w:val="24"/>
           <w:lang w:val="es-CO"/>
@@ -18127,6 +17807,7 @@
       <w:r>
         <w:rPr>
           <w:rFonts w:ascii="Arial" w:hAnsi="Arial" w:cs="Arial"/>
+          <w:noProof/>
           <w:sz w:val="24"/>
           <w:szCs w:val="24"/>
           <w:lang w:val="es-CO"/>

</xml_diff>